<commit_message>
fix problem with generator AS
</commit_message>
<xml_diff>
--- a/templates/TemplateOrderExecuteOrPrepAudit2026.docx
+++ b/templates/TemplateOrderExecuteOrPrepAudit2026.docx
@@ -105,25 +105,7 @@
           <w:color w:val="000000" w:themeColor="text1"/>
           <w:lang w:val="en-US"/>
         </w:rPr>
-        <w:t>{</w:t>
-      </w:r>
-      <w:proofErr w:type="spellStart"/>
-      <w:r>
-        <w:rPr>
-          <w:rFonts w:ascii="SB Sans Text Semibold" w:hAnsi="SB Sans Text Semibold" w:cs="SB Sans Text Semibold"/>
-          <w:color w:val="000000" w:themeColor="text1"/>
-          <w:lang w:val="en-US"/>
-        </w:rPr>
-        <w:t>TB_full_name</w:t>
-      </w:r>
-      <w:proofErr w:type="spellEnd"/>
-      <w:r>
-        <w:rPr>
-          <w:rFonts w:ascii="SB Sans Text Semibold" w:hAnsi="SB Sans Text Semibold" w:cs="SB Sans Text Semibold"/>
-          <w:color w:val="000000" w:themeColor="text1"/>
-          <w:lang w:val="en-US"/>
-        </w:rPr>
-        <w:t>}</w:t>
+        <w:t>{TB_full_name}</w:t>
       </w:r>
     </w:p>
     <w:p>
@@ -144,25 +126,7 @@
           <w:color w:val="000000" w:themeColor="text1"/>
           <w:lang w:val="en-US"/>
         </w:rPr>
-        <w:t>{/</w:t>
-      </w:r>
-      <w:proofErr w:type="spellStart"/>
-      <w:r>
-        <w:rPr>
-          <w:rFonts w:ascii="SB Sans Text Semibold" w:hAnsi="SB Sans Text Semibold" w:cs="SB Sans Text Semibold"/>
-          <w:color w:val="000000" w:themeColor="text1"/>
-          <w:lang w:val="en-US"/>
-        </w:rPr>
-        <w:t>showTB</w:t>
-      </w:r>
-      <w:proofErr w:type="spellEnd"/>
-      <w:r>
-        <w:rPr>
-          <w:rFonts w:ascii="SB Sans Text Semibold" w:hAnsi="SB Sans Text Semibold" w:cs="SB Sans Text Semibold"/>
-          <w:color w:val="000000" w:themeColor="text1"/>
-          <w:lang w:val="en-US"/>
-        </w:rPr>
-        <w:t>}</w:t>
+        <w:t>{/showTB}</w:t>
       </w:r>
     </w:p>
     <w:p>
@@ -399,7 +363,6 @@
         </w:rPr>
         <w:t>{</w:t>
       </w:r>
-      <w:proofErr w:type="spellStart"/>
       <w:r>
         <w:rPr>
           <w:rFonts w:ascii="Times New Roman" w:hAnsi="Times New Roman"/>
@@ -410,7 +373,6 @@
         </w:rPr>
         <w:t>pv</w:t>
       </w:r>
-      <w:proofErr w:type="spellEnd"/>
       <w:r>
         <w:rPr>
           <w:rFonts w:ascii="Times New Roman" w:hAnsi="Times New Roman"/>
@@ -545,7 +507,6 @@
         </w:rPr>
         <w:t>{</w:t>
       </w:r>
-      <w:proofErr w:type="spellStart"/>
       <w:r>
         <w:rPr>
           <w:rFonts w:ascii="Times New Roman" w:hAnsi="Times New Roman"/>
@@ -555,7 +516,6 @@
         </w:rPr>
         <w:t>podpunkt</w:t>
       </w:r>
-      <w:proofErr w:type="spellEnd"/>
       <w:r>
         <w:rPr>
           <w:rFonts w:ascii="Times New Roman" w:hAnsi="Times New Roman"/>
@@ -635,7 +595,6 @@
         </w:rPr>
         <w:t>{</w:t>
       </w:r>
-      <w:proofErr w:type="spellStart"/>
       <w:r>
         <w:rPr>
           <w:rFonts w:ascii="Times New Roman" w:hAnsi="Times New Roman"/>
@@ -645,7 +604,6 @@
         </w:rPr>
         <w:t>pv</w:t>
       </w:r>
-      <w:proofErr w:type="spellEnd"/>
       <w:r>
         <w:rPr>
           <w:rFonts w:ascii="Times New Roman" w:hAnsi="Times New Roman"/>
@@ -722,7 +680,6 @@
         </w:rPr>
         <w:t>{</w:t>
       </w:r>
-      <w:proofErr w:type="spellStart"/>
       <w:r>
         <w:rPr>
           <w:rFonts w:ascii="Times New Roman" w:hAnsi="Times New Roman"/>
@@ -731,7 +688,6 @@
         </w:rPr>
         <w:t>pv</w:t>
       </w:r>
-      <w:proofErr w:type="spellEnd"/>
       <w:r>
         <w:rPr>
           <w:rFonts w:ascii="Times New Roman" w:hAnsi="Times New Roman"/>
@@ -925,25 +881,7 @@
           <w:bCs/>
           <w:color w:val="000000" w:themeColor="text1"/>
         </w:rPr>
-        <w:t>{/</w:t>
-      </w:r>
-      <w:proofErr w:type="spellStart"/>
-      <w:r>
-        <w:rPr>
-          <w:rFonts w:ascii="Times New Roman" w:hAnsi="Times New Roman"/>
-          <w:bCs/>
-          <w:color w:val="000000" w:themeColor="text1"/>
-        </w:rPr>
-        <w:t>act_date</w:t>
-      </w:r>
-      <w:proofErr w:type="spellEnd"/>
-      <w:r>
-        <w:rPr>
-          <w:rFonts w:ascii="Times New Roman" w:hAnsi="Times New Roman"/>
-          <w:bCs/>
-          <w:color w:val="000000" w:themeColor="text1"/>
-        </w:rPr>
-        <w:t>}</w:t>
+        <w:t>{/act_date}</w:t>
       </w:r>
     </w:p>
     <w:p>
@@ -982,7 +920,6 @@
         </w:rPr>
         <w:t>{</w:t>
       </w:r>
-      <w:proofErr w:type="spellStart"/>
       <w:r>
         <w:rPr>
           <w:rFonts w:ascii="Times New Roman" w:hAnsi="Times New Roman"/>
@@ -992,7 +929,6 @@
         </w:rPr>
         <w:t>pv</w:t>
       </w:r>
-      <w:proofErr w:type="spellEnd"/>
       <w:r>
         <w:rPr>
           <w:rFonts w:ascii="Times New Roman" w:hAnsi="Times New Roman"/>
@@ -1033,7 +969,6 @@
         </w:rPr>
         <w:t>{</w:t>
       </w:r>
-      <w:proofErr w:type="spellStart"/>
       <w:r>
         <w:rPr>
           <w:rFonts w:ascii="Times New Roman" w:hAnsi="Times New Roman"/>
@@ -1042,7 +977,6 @@
         </w:rPr>
         <w:t>end_date</w:t>
       </w:r>
-      <w:proofErr w:type="spellEnd"/>
       <w:r>
         <w:rPr>
           <w:rFonts w:ascii="Times New Roman" w:hAnsi="Times New Roman"/>
@@ -1126,39 +1060,7 @@
           <w:rFonts w:ascii="Times New Roman" w:hAnsi="Times New Roman"/>
           <w:color w:val="000000" w:themeColor="text1"/>
         </w:rPr>
-        <w:t>{</w:t>
-      </w:r>
-      <w:proofErr w:type="spellStart"/>
-      <w:r>
-        <w:rPr>
-          <w:rFonts w:ascii="Times New Roman" w:hAnsi="Times New Roman"/>
-          <w:color w:val="000000" w:themeColor="text1"/>
-        </w:rPr>
-        <w:t>curator</w:t>
-      </w:r>
-      <w:proofErr w:type="spellEnd"/>
-      <w:r>
-        <w:rPr>
-          <w:rFonts w:ascii="Times New Roman" w:hAnsi="Times New Roman"/>
-          <w:color w:val="000000" w:themeColor="text1"/>
-        </w:rPr>
-        <w:t>} – {</w:t>
-      </w:r>
-      <w:proofErr w:type="spellStart"/>
-      <w:r>
-        <w:rPr>
-          <w:rFonts w:ascii="Times New Roman" w:hAnsi="Times New Roman"/>
-          <w:color w:val="000000" w:themeColor="text1"/>
-        </w:rPr>
-        <w:t>curator_plur</w:t>
-      </w:r>
-      <w:proofErr w:type="spellEnd"/>
-      <w:r>
-        <w:rPr>
-          <w:rFonts w:ascii="Times New Roman" w:hAnsi="Times New Roman"/>
-          <w:color w:val="000000" w:themeColor="text1"/>
-        </w:rPr>
-        <w:t>} проверки;</w:t>
+        <w:t>{curator} – {curator_plur} проверки;</w:t>
       </w:r>
     </w:p>
     <w:p>
@@ -1190,7 +1092,6 @@
         </w:rPr>
         <w:t>{</w:t>
       </w:r>
-      <w:proofErr w:type="spellStart"/>
       <w:r>
         <w:rPr>
           <w:rFonts w:ascii="Times New Roman" w:hAnsi="Times New Roman"/>
@@ -1198,7 +1099,6 @@
         </w:rPr>
         <w:t>supervisor</w:t>
       </w:r>
-      <w:proofErr w:type="spellEnd"/>
       <w:r>
         <w:rPr>
           <w:rFonts w:ascii="Times New Roman" w:hAnsi="Times New Roman"/>
@@ -1238,7 +1138,6 @@
         </w:rPr>
         <w:t>{#</w:t>
       </w:r>
-      <w:proofErr w:type="spellStart"/>
       <w:r>
         <w:rPr>
           <w:rFonts w:ascii="Times New Roman" w:hAnsi="Times New Roman"/>
@@ -1247,7 +1146,6 @@
         </w:rPr>
         <w:t>showSubsuper</w:t>
       </w:r>
-      <w:proofErr w:type="spellEnd"/>
       <w:r>
         <w:rPr>
           <w:rFonts w:ascii="Times New Roman" w:hAnsi="Times New Roman"/>
@@ -1286,7 +1184,6 @@
         </w:rPr>
         <w:t>{</w:t>
       </w:r>
-      <w:proofErr w:type="spellStart"/>
       <w:r>
         <w:rPr>
           <w:rFonts w:ascii="Times New Roman" w:hAnsi="Times New Roman"/>
@@ -1295,7 +1192,6 @@
         </w:rPr>
         <w:t>subsuper</w:t>
       </w:r>
-      <w:proofErr w:type="spellEnd"/>
       <w:r>
         <w:rPr>
           <w:rFonts w:ascii="Times New Roman" w:hAnsi="Times New Roman"/>
@@ -1356,7 +1252,6 @@
         </w:rPr>
         <w:t>{/</w:t>
       </w:r>
-      <w:proofErr w:type="spellStart"/>
       <w:r>
         <w:rPr>
           <w:rFonts w:ascii="Times New Roman" w:hAnsi="Times New Roman"/>
@@ -1365,7 +1260,6 @@
         </w:rPr>
         <w:t>showSubsuper</w:t>
       </w:r>
-      <w:proofErr w:type="spellEnd"/>
       <w:r>
         <w:rPr>
           <w:rFonts w:ascii="Times New Roman" w:hAnsi="Times New Roman"/>
@@ -1399,7 +1293,6 @@
         </w:rPr>
         <w:t>{#</w:t>
       </w:r>
-      <w:proofErr w:type="spellStart"/>
       <w:r>
         <w:rPr>
           <w:rFonts w:ascii="Times New Roman" w:hAnsi="Times New Roman"/>
@@ -1408,7 +1301,6 @@
         </w:rPr>
         <w:t>showLinkApp</w:t>
       </w:r>
-      <w:proofErr w:type="spellEnd"/>
       <w:r>
         <w:rPr>
           <w:rFonts w:ascii="Times New Roman" w:hAnsi="Times New Roman"/>
@@ -1622,7 +1514,6 @@
         </w:rPr>
         <w:t>{</w:t>
       </w:r>
-      <w:proofErr w:type="spellStart"/>
       <w:r>
         <w:rPr>
           <w:rFonts w:ascii="Times New Roman" w:hAnsi="Times New Roman"/>
@@ -1631,7 +1522,6 @@
         </w:rPr>
         <w:t>pv</w:t>
       </w:r>
-      <w:proofErr w:type="spellEnd"/>
       <w:r>
         <w:rPr>
           <w:rFonts w:ascii="Times New Roman" w:hAnsi="Times New Roman"/>
@@ -1660,25 +1550,7 @@
           <w:bCs/>
           <w:color w:val="000000" w:themeColor="text1"/>
         </w:rPr>
-        <w:t xml:space="preserve"> {</w:t>
-      </w:r>
-      <w:proofErr w:type="spellStart"/>
-      <w:r>
-        <w:rPr>
-          <w:rFonts w:ascii="Times New Roman" w:hAnsi="Times New Roman"/>
-          <w:bCs/>
-          <w:color w:val="000000" w:themeColor="text1"/>
-        </w:rPr>
-        <w:t>kps_and_ps_count</w:t>
-      </w:r>
-      <w:proofErr w:type="spellEnd"/>
-      <w:r>
-        <w:rPr>
-          <w:rFonts w:ascii="Times New Roman" w:hAnsi="Times New Roman"/>
-          <w:bCs/>
-          <w:color w:val="000000" w:themeColor="text1"/>
-        </w:rPr>
-        <w:t>}</w:t>
+        <w:t xml:space="preserve"> {kps_and_ps_count}</w:t>
       </w:r>
       <w:r>
         <w:rPr>
@@ -1709,7 +1581,6 @@
         </w:rPr>
         <w:t>{</w:t>
       </w:r>
-      <w:proofErr w:type="spellStart"/>
       <w:r>
         <w:rPr>
           <w:rFonts w:ascii="Times New Roman" w:hAnsi="Times New Roman"/>
@@ -1717,7 +1588,6 @@
         </w:rPr>
         <w:t>pril</w:t>
       </w:r>
-      <w:proofErr w:type="spellEnd"/>
       <w:r>
         <w:rPr>
           <w:rFonts w:ascii="Times New Roman" w:hAnsi="Times New Roman"/>
@@ -1941,7 +1811,6 @@
         </w:rPr>
         <w:t>{</w:t>
       </w:r>
-      <w:proofErr w:type="spellStart"/>
       <w:r>
         <w:rPr>
           <w:rFonts w:ascii="Times New Roman" w:hAnsi="Times New Roman"/>
@@ -1949,14 +1818,12 @@
         </w:rPr>
         <w:t>pril</w:t>
       </w:r>
-      <w:proofErr w:type="spellEnd"/>
       <w:r>
         <w:rPr>
           <w:rFonts w:ascii="Times New Roman" w:hAnsi="Times New Roman"/>
         </w:rPr>
         <w:t>_</w:t>
       </w:r>
-      <w:proofErr w:type="spellStart"/>
       <w:r>
         <w:rPr>
           <w:rFonts w:ascii="Times New Roman" w:hAnsi="Times New Roman"/>
@@ -1971,7 +1838,6 @@
         </w:rPr>
         <w:t>ki</w:t>
       </w:r>
-      <w:proofErr w:type="spellEnd"/>
       <w:r>
         <w:rPr>
           <w:rFonts w:ascii="Times New Roman" w:hAnsi="Times New Roman"/>
@@ -2101,7 +1967,6 @@
         </w:rPr>
         <w:t>{</w:t>
       </w:r>
-      <w:proofErr w:type="spellStart"/>
       <w:r>
         <w:rPr>
           <w:rFonts w:ascii="Times New Roman" w:hAnsi="Times New Roman"/>
@@ -2110,7 +1975,6 @@
         </w:rPr>
         <w:t>dir</w:t>
       </w:r>
-      <w:proofErr w:type="spellEnd"/>
       <w:r>
         <w:rPr>
           <w:rFonts w:ascii="Times New Roman" w:hAnsi="Times New Roman"/>
@@ -2208,7 +2072,6 @@
               </w:rPr>
               <w:t>{</w:t>
             </w:r>
-            <w:proofErr w:type="spellStart"/>
             <w:r>
               <w:rPr>
                 <w:b/>
@@ -2216,7 +2079,6 @@
               </w:rPr>
               <w:t>podpis_title</w:t>
             </w:r>
-            <w:proofErr w:type="spellEnd"/>
             <w:r>
               <w:rPr>
                 <w:b/>
@@ -2279,7 +2141,6 @@
               </w:rPr>
               <w:t>{</w:t>
             </w:r>
-            <w:proofErr w:type="spellStart"/>
             <w:r>
               <w:rPr>
                 <w:b/>
@@ -2287,7 +2148,6 @@
               </w:rPr>
               <w:t>podpis_fio</w:t>
             </w:r>
-            <w:proofErr w:type="spellEnd"/>
             <w:r>
               <w:rPr>
                 <w:b/>
@@ -2386,7 +2246,6 @@
         </w:rPr>
         <w:t>{</w:t>
       </w:r>
-      <w:proofErr w:type="spellStart"/>
       <w:r>
         <w:rPr>
           <w:rFonts w:ascii="Times New Roman" w:hAnsi="Times New Roman"/>
@@ -2395,7 +2254,6 @@
         </w:rPr>
         <w:t>pv</w:t>
       </w:r>
-      <w:proofErr w:type="spellEnd"/>
       <w:r>
         <w:rPr>
           <w:rFonts w:ascii="Times New Roman" w:hAnsi="Times New Roman"/>
@@ -2436,11 +2294,12 @@
       </w:tblPr>
       <w:tblGrid>
         <w:gridCol w:w="2174"/>
-        <w:gridCol w:w="3645"/>
-        <w:gridCol w:w="2291"/>
-        <w:gridCol w:w="2209"/>
-        <w:gridCol w:w="2200"/>
-        <w:gridCol w:w="2644"/>
+        <w:gridCol w:w="2719"/>
+        <w:gridCol w:w="2515"/>
+        <w:gridCol w:w="1952"/>
+        <w:gridCol w:w="1675"/>
+        <w:gridCol w:w="2104"/>
+        <w:gridCol w:w="2024"/>
       </w:tblGrid>
       <w:tr>
         <w:trPr>
@@ -2470,7 +2329,7 @@
         </w:tc>
         <w:tc>
           <w:tcPr>
-            <w:tcW w:w="3645" w:type="dxa"/>
+            <w:tcW w:w="2783" w:type="dxa"/>
             <w:shd w:val="clear" w:color="auto" w:fill="EDEDED" w:themeFill="accent3" w:themeFillTint="33"/>
           </w:tcPr>
           <w:p>
@@ -2490,7 +2349,7 @@
         </w:tc>
         <w:tc>
           <w:tcPr>
-            <w:tcW w:w="2291" w:type="dxa"/>
+            <w:tcW w:w="2551" w:type="dxa"/>
             <w:shd w:val="clear" w:color="auto" w:fill="EDEDED" w:themeFill="accent3" w:themeFillTint="33"/>
           </w:tcPr>
           <w:p>
@@ -2510,7 +2369,7 @@
         </w:tc>
         <w:tc>
           <w:tcPr>
-            <w:tcW w:w="2209" w:type="dxa"/>
+            <w:tcW w:w="1985" w:type="dxa"/>
             <w:shd w:val="clear" w:color="auto" w:fill="EDEDED" w:themeFill="accent3" w:themeFillTint="33"/>
           </w:tcPr>
           <w:p>
@@ -2525,29 +2384,13 @@
                 <w:b/>
                 <w:lang w:val="en-US"/>
               </w:rPr>
-              <w:t>{</w:t>
-            </w:r>
-            <w:proofErr w:type="spellStart"/>
-            <w:r>
-              <w:rPr>
-                <w:b/>
-                <w:lang w:val="en-US"/>
-              </w:rPr>
-              <w:t>ca_tb</w:t>
-            </w:r>
-            <w:proofErr w:type="spellEnd"/>
-            <w:r>
-              <w:rPr>
-                <w:b/>
-                <w:lang w:val="en-US"/>
-              </w:rPr>
-              <w:t>}</w:t>
+              <w:t>{ca_tb}</w:t>
             </w:r>
           </w:p>
         </w:tc>
         <w:tc>
           <w:tcPr>
-            <w:tcW w:w="2200" w:type="dxa"/>
+            <w:tcW w:w="1701" w:type="dxa"/>
             <w:shd w:val="clear" w:color="auto" w:fill="EDEDED" w:themeFill="accent3" w:themeFillTint="33"/>
           </w:tcPr>
           <w:p>
@@ -2567,7 +2410,7 @@
         </w:tc>
         <w:tc>
           <w:tcPr>
-            <w:tcW w:w="2644" w:type="dxa"/>
+            <w:tcW w:w="2126" w:type="dxa"/>
             <w:shd w:val="clear" w:color="auto" w:fill="EDEDED" w:themeFill="accent3" w:themeFillTint="33"/>
           </w:tcPr>
           <w:p>
@@ -2581,7 +2424,41 @@
               <w:rPr>
                 <w:b/>
               </w:rPr>
-              <w:t>Табельный номер</w:t>
+              <w:t xml:space="preserve">Табельный </w:t>
+            </w:r>
+          </w:p>
+          <w:p>
+            <w:pPr>
+              <w:jc w:val="center"/>
+              <w:rPr>
+                <w:b/>
+              </w:rPr>
+            </w:pPr>
+            <w:r>
+              <w:rPr>
+                <w:b/>
+              </w:rPr>
+              <w:t>номер</w:t>
+            </w:r>
+          </w:p>
+        </w:tc>
+        <w:tc>
+          <w:tcPr>
+            <w:tcW w:w="1843" w:type="dxa"/>
+            <w:shd w:val="clear" w:color="auto" w:fill="EDEDED" w:themeFill="accent3" w:themeFillTint="33"/>
+          </w:tcPr>
+          <w:p>
+            <w:pPr>
+              <w:jc w:val="center"/>
+              <w:rPr>
+                <w:b/>
+              </w:rPr>
+            </w:pPr>
+            <w:r>
+              <w:rPr>
+                <w:b/>
+              </w:rPr>
+              <w:t>Уровень доступа</w:t>
             </w:r>
           </w:p>
         </w:tc>
@@ -2626,7 +2503,7 @@
         </w:tc>
         <w:tc>
           <w:tcPr>
-            <w:tcW w:w="3645" w:type="dxa"/>
+            <w:tcW w:w="2783" w:type="dxa"/>
             <w:shd w:val="clear" w:color="auto" w:fill="auto"/>
           </w:tcPr>
           <w:p>
@@ -2640,14 +2517,12 @@
             <w:r>
               <w:t>{</w:t>
             </w:r>
-            <w:proofErr w:type="spellStart"/>
             <w:r>
               <w:rPr>
                 <w:lang w:val="en-US"/>
               </w:rPr>
               <w:t>fio</w:t>
             </w:r>
-            <w:proofErr w:type="spellEnd"/>
             <w:r>
               <w:t>}</w:t>
             </w:r>
@@ -2655,7 +2530,7 @@
         </w:tc>
         <w:tc>
           <w:tcPr>
-            <w:tcW w:w="2291" w:type="dxa"/>
+            <w:tcW w:w="2551" w:type="dxa"/>
             <w:shd w:val="clear" w:color="auto" w:fill="auto"/>
           </w:tcPr>
           <w:p>
@@ -2688,7 +2563,7 @@
         </w:tc>
         <w:tc>
           <w:tcPr>
-            <w:tcW w:w="2209" w:type="dxa"/>
+            <w:tcW w:w="1985" w:type="dxa"/>
             <w:shd w:val="clear" w:color="auto" w:fill="auto"/>
           </w:tcPr>
           <w:p>
@@ -2721,7 +2596,7 @@
         </w:tc>
         <w:tc>
           <w:tcPr>
-            <w:tcW w:w="2200" w:type="dxa"/>
+            <w:tcW w:w="1701" w:type="dxa"/>
             <w:shd w:val="clear" w:color="auto" w:fill="auto"/>
           </w:tcPr>
           <w:p>
@@ -2748,7 +2623,7 @@
         </w:tc>
         <w:tc>
           <w:tcPr>
-            <w:tcW w:w="2644" w:type="dxa"/>
+            <w:tcW w:w="2126" w:type="dxa"/>
             <w:shd w:val="clear" w:color="auto" w:fill="auto"/>
           </w:tcPr>
           <w:p>
@@ -2768,16 +2643,36 @@
             <w:r>
               <w:t>{</w:t>
             </w:r>
-            <w:proofErr w:type="spellStart"/>
             <w:r>
               <w:rPr>
                 <w:lang w:val="en-US"/>
               </w:rPr>
               <w:t>tn</w:t>
             </w:r>
-            <w:proofErr w:type="spellEnd"/>
             <w:r>
               <w:t>}</w:t>
+            </w:r>
+          </w:p>
+        </w:tc>
+        <w:tc>
+          <w:tcPr>
+            <w:tcW w:w="1843" w:type="dxa"/>
+          </w:tcPr>
+          <w:p>
+            <w:pPr>
+              <w:suppressLineNumbers/>
+              <w:jc w:val="center"/>
+              <w:rPr>
+                <w:color w:val="000000" w:themeColor="text1"/>
+                <w:lang w:val="en-US"/>
+              </w:rPr>
+            </w:pPr>
+            <w:r>
+              <w:rPr>
+                <w:color w:val="000000" w:themeColor="text1"/>
+                <w:lang w:val="en-US"/>
+              </w:rPr>
+              <w:t>{lvl}</w:t>
             </w:r>
             <w:r>
               <w:rPr>
@@ -2856,7 +2751,6 @@
         </w:rPr>
         <w:t>{</w:t>
       </w:r>
-      <w:proofErr w:type="spellStart"/>
       <w:r>
         <w:rPr>
           <w:rFonts w:ascii="Times New Roman" w:hAnsi="Times New Roman"/>
@@ -2865,7 +2759,6 @@
         </w:rPr>
         <w:t>pril</w:t>
       </w:r>
-      <w:proofErr w:type="spellEnd"/>
       <w:r>
         <w:rPr>
           <w:rFonts w:ascii="Times New Roman" w:hAnsi="Times New Roman"/>
@@ -2936,13 +2829,6 @@
           <w:b/>
         </w:rPr>
         <w:t>Банка</w:t>
-      </w:r>
-      <w:r>
-        <w:rPr>
-          <w:rStyle w:val="af"/>
-          <w:rFonts w:ascii="Times New Roman" w:hAnsi="Times New Roman"/>
-        </w:rPr>
-        <w:footnoteReference w:id="4"/>
       </w:r>
     </w:p>
     <w:p>
@@ -3022,6 +2908,12 @@
               </w:rPr>
               <w:t>Процессы</w:t>
             </w:r>
+            <w:r>
+              <w:rPr>
+                <w:rStyle w:val="af"/>
+              </w:rPr>
+              <w:footnoteReference w:id="4"/>
+            </w:r>
           </w:p>
         </w:tc>
       </w:tr>
@@ -3308,14 +3200,12 @@
             <w:r>
               <w:t>{</w:t>
             </w:r>
-            <w:proofErr w:type="spellStart"/>
             <w:r>
               <w:rPr>
                 <w:lang w:val="en-US"/>
               </w:rPr>
               <w:t>kp_code</w:t>
             </w:r>
-            <w:proofErr w:type="spellEnd"/>
             <w:r>
               <w:t>}</w:t>
             </w:r>
@@ -3340,14 +3230,12 @@
             <w:r>
               <w:t>{</w:t>
             </w:r>
-            <w:proofErr w:type="spellStart"/>
             <w:r>
               <w:rPr>
                 <w:lang w:val="en-US"/>
               </w:rPr>
               <w:t>kp_name</w:t>
             </w:r>
-            <w:proofErr w:type="spellEnd"/>
             <w:r>
               <w:t>}</w:t>
             </w:r>
@@ -3372,14 +3260,12 @@
             <w:r>
               <w:t>{</w:t>
             </w:r>
-            <w:proofErr w:type="spellStart"/>
             <w:r>
               <w:rPr>
                 <w:lang w:val="en-US"/>
               </w:rPr>
               <w:t>kp_owner</w:t>
             </w:r>
-            <w:proofErr w:type="spellEnd"/>
             <w:r>
               <w:t>}</w:t>
             </w:r>
@@ -3405,7 +3291,6 @@
             <w:r>
               <w:t>{</w:t>
             </w:r>
-            <w:proofErr w:type="spellStart"/>
             <w:r>
               <w:rPr>
                 <w:lang w:val="en-US"/>
@@ -3418,7 +3303,6 @@
               </w:rPr>
               <w:t>i</w:t>
             </w:r>
-            <w:proofErr w:type="spellEnd"/>
             <w:r>
               <w:t>}</w:t>
             </w:r>
@@ -3443,14 +3327,12 @@
             <w:r>
               <w:t>{</w:t>
             </w:r>
-            <w:proofErr w:type="spellStart"/>
             <w:r>
               <w:rPr>
                 <w:lang w:val="en-US"/>
               </w:rPr>
               <w:t>p_code</w:t>
             </w:r>
-            <w:proofErr w:type="spellEnd"/>
             <w:r>
               <w:t>}</w:t>
             </w:r>
@@ -3475,14 +3357,12 @@
             <w:r>
               <w:t>{</w:t>
             </w:r>
-            <w:proofErr w:type="spellStart"/>
             <w:r>
               <w:rPr>
                 <w:lang w:val="en-US"/>
               </w:rPr>
               <w:t>p_name</w:t>
             </w:r>
-            <w:proofErr w:type="spellEnd"/>
             <w:r>
               <w:t>}</w:t>
             </w:r>
@@ -3507,14 +3387,12 @@
             <w:r>
               <w:t>{</w:t>
             </w:r>
-            <w:proofErr w:type="spellStart"/>
             <w:r>
               <w:rPr>
                 <w:lang w:val="en-US"/>
               </w:rPr>
               <w:t>p_owner</w:t>
             </w:r>
-            <w:proofErr w:type="spellEnd"/>
             <w:r>
               <w:t>}</w:t>
             </w:r>
@@ -3556,7 +3434,6 @@
         <w:rPr>
           <w:rFonts w:ascii="Times New Roman" w:hAnsi="Times New Roman"/>
           <w:b/>
-          <w:lang w:val="en-US"/>
         </w:rPr>
         <w:t>/</w:t>
       </w:r>
@@ -3614,7 +3491,6 @@
         </w:rPr>
         <w:t>{</w:t>
       </w:r>
-      <w:proofErr w:type="spellStart"/>
       <w:r>
         <w:rPr>
           <w:rFonts w:ascii="Times New Roman" w:hAnsi="Times New Roman"/>
@@ -3625,7 +3501,6 @@
         </w:rPr>
         <w:t>pril</w:t>
       </w:r>
-      <w:proofErr w:type="spellEnd"/>
       <w:r>
         <w:rPr>
           <w:rFonts w:ascii="Times New Roman" w:hAnsi="Times New Roman"/>
@@ -3635,7 +3510,6 @@
         </w:rPr>
         <w:t>_</w:t>
       </w:r>
-      <w:proofErr w:type="spellStart"/>
       <w:r>
         <w:rPr>
           <w:rFonts w:ascii="Times New Roman" w:hAnsi="Times New Roman"/>
@@ -3646,7 +3520,6 @@
         </w:rPr>
         <w:t>aski</w:t>
       </w:r>
-      <w:proofErr w:type="spellEnd"/>
       <w:r>
         <w:rPr>
           <w:rFonts w:ascii="Times New Roman" w:hAnsi="Times New Roman"/>
@@ -3741,7 +3614,6 @@
         </w:rPr>
         <w:t>{</w:t>
       </w:r>
-      <w:proofErr w:type="spellStart"/>
       <w:r>
         <w:rPr>
           <w:rFonts w:ascii="Times New Roman" w:hAnsi="Times New Roman"/>
@@ -3750,7 +3622,6 @@
         </w:rPr>
         <w:t>pv</w:t>
       </w:r>
-      <w:proofErr w:type="spellEnd"/>
       <w:r>
         <w:rPr>
           <w:rFonts w:ascii="Times New Roman" w:hAnsi="Times New Roman"/>
@@ -3758,7 +3629,6 @@
         </w:rPr>
         <w:t>_</w:t>
       </w:r>
-      <w:proofErr w:type="spellStart"/>
       <w:r>
         <w:rPr>
           <w:rFonts w:ascii="Times New Roman" w:hAnsi="Times New Roman"/>
@@ -3767,7 +3637,6 @@
         </w:rPr>
         <w:t>ases</w:t>
       </w:r>
-      <w:proofErr w:type="spellEnd"/>
       <w:r>
         <w:rPr>
           <w:rFonts w:ascii="Times New Roman" w:hAnsi="Times New Roman"/>
@@ -3786,463 +3655,24 @@
         </w:rPr>
       </w:pPr>
     </w:p>
-    <w:tbl>
-      <w:tblPr>
-        <w:tblStyle w:val="af0"/>
-        <w:tblW w:w="5000" w:type="pct"/>
-        <w:tblLook w:val="04A0" w:firstRow="1" w:lastRow="0" w:firstColumn="1" w:lastColumn="0" w:noHBand="0" w:noVBand="1"/>
-      </w:tblPr>
-      <w:tblGrid>
-        <w:gridCol w:w="1252"/>
-        <w:gridCol w:w="2637"/>
-        <w:gridCol w:w="2219"/>
-        <w:gridCol w:w="3059"/>
-        <w:gridCol w:w="2452"/>
-        <w:gridCol w:w="1707"/>
-        <w:gridCol w:w="1831"/>
-      </w:tblGrid>
-      <w:tr>
-        <w:trPr>
-          <w:trHeight w:val="1011"/>
-          <w:tblHeader/>
-        </w:trPr>
-        <w:tc>
-          <w:tcPr>
-            <w:tcW w:w="413" w:type="pct"/>
-            <w:shd w:val="clear" w:color="auto" w:fill="EDEDED" w:themeFill="accent3" w:themeFillTint="33"/>
-            <w:vAlign w:val="center"/>
-          </w:tcPr>
-          <w:p>
-            <w:pPr>
-              <w:suppressAutoHyphens/>
-              <w:jc w:val="center"/>
-              <w:rPr>
-                <w:b/>
-                <w:szCs w:val="20"/>
-              </w:rPr>
-            </w:pPr>
-            <w:r>
-              <w:rPr>
-                <w:b/>
-                <w:szCs w:val="20"/>
-              </w:rPr>
-              <w:t>№ п/п</w:t>
-            </w:r>
-          </w:p>
-        </w:tc>
-        <w:tc>
-          <w:tcPr>
-            <w:tcW w:w="870" w:type="pct"/>
-            <w:shd w:val="clear" w:color="auto" w:fill="EDEDED" w:themeFill="accent3" w:themeFillTint="33"/>
-            <w:vAlign w:val="center"/>
-          </w:tcPr>
-          <w:p>
-            <w:pPr>
-              <w:suppressAutoHyphens/>
-              <w:jc w:val="center"/>
-              <w:rPr>
-                <w:b/>
-                <w:szCs w:val="20"/>
-              </w:rPr>
-            </w:pPr>
-            <w:r>
-              <w:rPr>
-                <w:b/>
-                <w:szCs w:val="20"/>
-              </w:rPr>
-              <w:t>Наименование информационного ресурса</w:t>
-            </w:r>
-            <w:r>
-              <w:rPr>
-                <w:rStyle w:val="af"/>
-                <w:b/>
-              </w:rPr>
-              <w:footnoteReference w:id="5"/>
-            </w:r>
-          </w:p>
-        </w:tc>
-        <w:tc>
-          <w:tcPr>
-            <w:tcW w:w="732" w:type="pct"/>
-            <w:shd w:val="clear" w:color="auto" w:fill="EDEDED" w:themeFill="accent3" w:themeFillTint="33"/>
-            <w:vAlign w:val="center"/>
-          </w:tcPr>
-          <w:p>
-            <w:pPr>
-              <w:suppressAutoHyphens/>
-              <w:jc w:val="center"/>
-              <w:rPr>
-                <w:b/>
-                <w:szCs w:val="20"/>
-              </w:rPr>
-            </w:pPr>
-            <w:r>
-              <w:rPr>
-                <w:b/>
-                <w:szCs w:val="20"/>
-              </w:rPr>
-              <w:t>Номер информационного ресурса (КЭ)</w:t>
-            </w:r>
-          </w:p>
-        </w:tc>
-        <w:tc>
-          <w:tcPr>
-            <w:tcW w:w="1009" w:type="pct"/>
-            <w:shd w:val="clear" w:color="auto" w:fill="EDEDED" w:themeFill="accent3" w:themeFillTint="33"/>
-            <w:vAlign w:val="center"/>
-          </w:tcPr>
-          <w:p>
-            <w:pPr>
-              <w:suppressAutoHyphens/>
-              <w:jc w:val="center"/>
-              <w:rPr>
-                <w:b/>
-                <w:szCs w:val="20"/>
-              </w:rPr>
-            </w:pPr>
-            <w:r>
-              <w:rPr>
-                <w:b/>
-                <w:szCs w:val="20"/>
-              </w:rPr>
-              <w:t>Необходимая роль/группа доступа</w:t>
-            </w:r>
-          </w:p>
-        </w:tc>
-        <w:tc>
-          <w:tcPr>
-            <w:tcW w:w="809" w:type="pct"/>
-            <w:shd w:val="clear" w:color="auto" w:fill="EDEDED" w:themeFill="accent3" w:themeFillTint="33"/>
-            <w:vAlign w:val="center"/>
-          </w:tcPr>
-          <w:p>
-            <w:pPr>
-              <w:suppressAutoHyphens/>
-              <w:jc w:val="center"/>
-              <w:rPr>
-                <w:b/>
-                <w:szCs w:val="20"/>
-              </w:rPr>
-            </w:pPr>
-            <w:r>
-              <w:rPr>
-                <w:b/>
-                <w:szCs w:val="20"/>
-              </w:rPr>
-              <w:t>ФИО сотрудника</w:t>
-            </w:r>
-          </w:p>
-        </w:tc>
-        <w:tc>
-          <w:tcPr>
-            <w:tcW w:w="563" w:type="pct"/>
-            <w:shd w:val="clear" w:color="auto" w:fill="EDEDED" w:themeFill="accent3" w:themeFillTint="33"/>
-            <w:vAlign w:val="center"/>
-          </w:tcPr>
-          <w:p>
-            <w:pPr>
-              <w:suppressAutoHyphens/>
-              <w:jc w:val="center"/>
-              <w:rPr>
-                <w:b/>
-                <w:szCs w:val="20"/>
-              </w:rPr>
-            </w:pPr>
-            <w:r>
-              <w:rPr>
-                <w:b/>
-                <w:szCs w:val="20"/>
-              </w:rPr>
-              <w:t>Должность</w:t>
-            </w:r>
-          </w:p>
-        </w:tc>
-        <w:tc>
-          <w:tcPr>
-            <w:tcW w:w="604" w:type="pct"/>
-            <w:shd w:val="clear" w:color="auto" w:fill="EDEDED" w:themeFill="accent3" w:themeFillTint="33"/>
-            <w:vAlign w:val="center"/>
-          </w:tcPr>
-          <w:p>
-            <w:pPr>
-              <w:suppressAutoHyphens/>
-              <w:jc w:val="center"/>
-              <w:rPr>
-                <w:b/>
-                <w:szCs w:val="20"/>
-              </w:rPr>
-            </w:pPr>
-            <w:r>
-              <w:rPr>
-                <w:b/>
-                <w:szCs w:val="20"/>
-              </w:rPr>
-              <w:t>Табельный номер</w:t>
-            </w:r>
-          </w:p>
-        </w:tc>
-      </w:tr>
-      <w:tr>
-        <w:trPr>
-          <w:trHeight w:val="1290"/>
-        </w:trPr>
-        <w:tc>
-          <w:tcPr>
-            <w:tcW w:w="413" w:type="pct"/>
-            <w:vAlign w:val="center"/>
-          </w:tcPr>
-          <w:p>
-            <w:pPr>
-              <w:suppressAutoHyphens/>
-              <w:jc w:val="center"/>
-              <w:rPr>
-                <w:color w:val="000000" w:themeColor="text1"/>
-              </w:rPr>
-            </w:pPr>
-            <w:r>
-              <w:rPr>
-                <w:color w:val="000000"/>
-                <w:lang w:val="en-US"/>
-              </w:rPr>
-              <w:t>{#aski}</w:t>
-            </w:r>
-            <w:r>
-              <w:rPr>
-                <w:color w:val="000000" w:themeColor="text1"/>
-                <w:lang w:val="en-US"/>
-              </w:rPr>
-              <w:t>{</w:t>
-            </w:r>
-            <w:r>
-              <w:rPr>
-                <w:color w:val="000000" w:themeColor="text1"/>
-                <w:lang w:val="en-US"/>
-              </w:rPr>
-              <w:t>i</w:t>
-            </w:r>
-            <w:r>
-              <w:rPr>
-                <w:color w:val="000000" w:themeColor="text1"/>
-                <w:lang w:val="en-US"/>
-              </w:rPr>
-              <w:t>}</w:t>
-            </w:r>
-          </w:p>
-        </w:tc>
-        <w:tc>
-          <w:tcPr>
-            <w:tcW w:w="870" w:type="pct"/>
-            <w:shd w:val="clear" w:color="auto" w:fill="auto"/>
-            <w:vAlign w:val="center"/>
-          </w:tcPr>
-          <w:p>
-            <w:pPr>
-              <w:suppressAutoHyphens/>
-              <w:jc w:val="center"/>
-              <w:rPr>
-                <w:color w:val="000000" w:themeColor="text1"/>
-              </w:rPr>
-            </w:pPr>
-            <w:r>
-              <w:rPr>
-                <w:lang w:val="en-US"/>
-              </w:rPr>
-              <w:t>{</w:t>
-            </w:r>
-            <w:r>
-              <w:rPr>
-                <w:lang w:val="en-US"/>
-              </w:rPr>
-              <w:t>name</w:t>
-            </w:r>
-            <w:r>
-              <w:rPr>
-                <w:lang w:val="en-US"/>
-              </w:rPr>
-              <w:t>}</w:t>
-            </w:r>
-          </w:p>
-        </w:tc>
-        <w:tc>
-          <w:tcPr>
-            <w:tcW w:w="732" w:type="pct"/>
-            <w:vAlign w:val="center"/>
-          </w:tcPr>
-          <w:p>
-            <w:pPr>
-              <w:suppressAutoHyphens/>
-              <w:jc w:val="center"/>
-              <w:rPr>
-                <w:color w:val="000000" w:themeColor="text1"/>
-              </w:rPr>
-            </w:pPr>
-            <w:r>
-              <w:rPr>
-                <w:lang w:val="en-US"/>
-              </w:rPr>
-              <w:t>{</w:t>
-            </w:r>
-            <w:proofErr w:type="spellStart"/>
-            <w:r>
-              <w:rPr>
-                <w:lang w:val="en-US"/>
-              </w:rPr>
-              <w:t>ke</w:t>
-            </w:r>
-            <w:proofErr w:type="spellEnd"/>
-            <w:r>
-              <w:rPr>
-                <w:lang w:val="en-US"/>
-              </w:rPr>
-              <w:t>}</w:t>
-            </w:r>
-          </w:p>
-        </w:tc>
-        <w:tc>
-          <w:tcPr>
-            <w:tcW w:w="1009" w:type="pct"/>
-            <w:vAlign w:val="center"/>
-          </w:tcPr>
-          <w:p>
-            <w:pPr>
-              <w:suppressAutoHyphens/>
-              <w:jc w:val="center"/>
-              <w:rPr>
-                <w:color w:val="000000" w:themeColor="text1"/>
-                <w:highlight w:val="yellow"/>
-              </w:rPr>
-            </w:pPr>
-            <w:r>
-              <w:rPr>
-                <w:lang w:val="en-US"/>
-              </w:rPr>
-              <w:t>{</w:t>
-            </w:r>
-            <w:r>
-              <w:rPr>
-                <w:lang w:val="en-US"/>
-              </w:rPr>
-              <w:t>roles</w:t>
-            </w:r>
-            <w:r>
-              <w:rPr>
-                <w:lang w:val="en-US"/>
-              </w:rPr>
-              <w:t>}</w:t>
-            </w:r>
-          </w:p>
-        </w:tc>
-        <w:tc>
-          <w:tcPr>
-            <w:tcW w:w="809" w:type="pct"/>
-            <w:vAlign w:val="center"/>
-          </w:tcPr>
-          <w:p>
-            <w:pPr>
-              <w:jc w:val="center"/>
-              <w:rPr>
-                <w:color w:val="000000" w:themeColor="text1"/>
-              </w:rPr>
-            </w:pPr>
-            <w:r>
-              <w:t>{</w:t>
-            </w:r>
-            <w:r>
-              <w:rPr>
-                <w:lang w:val="en-US"/>
-              </w:rPr>
-              <w:t>emp</w:t>
-            </w:r>
-            <w:r>
-              <w:t>_</w:t>
-            </w:r>
-            <w:r>
-              <w:rPr>
-                <w:lang w:val="en-US"/>
-              </w:rPr>
-              <w:t>name</w:t>
-            </w:r>
-            <w:r>
-              <w:t>}</w:t>
-            </w:r>
-          </w:p>
-        </w:tc>
-        <w:tc>
-          <w:tcPr>
-            <w:tcW w:w="563" w:type="pct"/>
-            <w:vAlign w:val="center"/>
-          </w:tcPr>
-          <w:p>
-            <w:pPr>
-              <w:jc w:val="center"/>
-              <w:rPr>
-                <w:color w:val="000000" w:themeColor="text1"/>
-              </w:rPr>
-            </w:pPr>
-            <w:r>
-              <w:t>{</w:t>
-            </w:r>
-            <w:r>
-              <w:rPr>
-                <w:lang w:val="en-US"/>
-              </w:rPr>
-              <w:t>title</w:t>
-            </w:r>
-            <w:r>
-              <w:t>}</w:t>
-            </w:r>
-          </w:p>
-        </w:tc>
-        <w:tc>
-          <w:tcPr>
-            <w:tcW w:w="604" w:type="pct"/>
-            <w:vAlign w:val="center"/>
-          </w:tcPr>
-          <w:p>
-            <w:pPr>
-              <w:jc w:val="center"/>
-              <w:rPr>
-                <w:color w:val="000000" w:themeColor="text1"/>
-              </w:rPr>
-            </w:pPr>
-            <w:r>
-              <w:t>{</w:t>
-            </w:r>
-            <w:proofErr w:type="spellStart"/>
-            <w:r>
-              <w:rPr>
-                <w:lang w:val="en-US"/>
-              </w:rPr>
-              <w:t>tn</w:t>
-            </w:r>
-            <w:proofErr w:type="spellEnd"/>
-            <w:r>
-              <w:t>}</w:t>
-            </w:r>
-            <w:r>
-              <w:rPr>
-                <w:color w:val="000000"/>
-              </w:rPr>
-              <w:t>{/</w:t>
-            </w:r>
-            <w:proofErr w:type="spellStart"/>
-            <w:r>
-              <w:rPr>
-                <w:color w:val="000000"/>
-              </w:rPr>
-              <w:t>aski</w:t>
-            </w:r>
-            <w:proofErr w:type="spellEnd"/>
-            <w:r>
-              <w:rPr>
-                <w:color w:val="000000"/>
-              </w:rPr>
-              <w:t>}</w:t>
-            </w:r>
-          </w:p>
-        </w:tc>
-      </w:tr>
-    </w:tbl>
+    <w:p>
+      <w:pPr>
+        <w:tabs>
+          <w:tab w:val="left" w:pos="9343"/>
+        </w:tabs>
+        <w:rPr>
+          <w:rFonts w:ascii="Times New Roman" w:hAnsi="Times New Roman"/>
+          <w:b/>
+        </w:rPr>
+      </w:pPr>
+      <w:r>
+        <w:rPr>
+          <w:rFonts w:ascii="Times New Roman" w:hAnsi="Times New Roman"/>
+          <w:b/>
+        </w:rPr>
+        <w:t>{@aski_table}</w:t>
+      </w:r>
+    </w:p>
     <w:p>
       <w:pPr>
         <w:tabs>
@@ -4445,25 +3875,7 @@
         <w:rPr>
           <w:rFonts w:ascii="Times New Roman" w:hAnsi="Times New Roman"/>
         </w:rPr>
-        <w:t xml:space="preserve">о аудита ПАО Сбербанк на </w:t>
-      </w:r>
-      <w:r>
-        <w:rPr>
-          <w:rFonts w:ascii="Times New Roman" w:hAnsi="Times New Roman"/>
-        </w:rPr>
-        <w:t>202</w:t>
-      </w:r>
-      <w:r>
-        <w:rPr>
-          <w:rFonts w:ascii="Times New Roman" w:hAnsi="Times New Roman"/>
-        </w:rPr>
-        <w:t>6</w:t>
-      </w:r>
-      <w:r>
-        <w:rPr>
-          <w:rFonts w:ascii="Times New Roman" w:hAnsi="Times New Roman"/>
-        </w:rPr>
-        <w:t xml:space="preserve"> год</w:t>
+        <w:t>о аудита ПАО Сбербанк</w:t>
       </w:r>
       <w:r>
         <w:rPr>
@@ -4499,7 +3911,13 @@
         <w:rPr>
           <w:rFonts w:ascii="Times New Roman" w:hAnsi="Times New Roman"/>
         </w:rPr>
-        <w:t xml:space="preserve"> Наименование путей и процессов утверждены Распоряжением от 28.01.2022 № 202-Р «Об утверждении Реестра Клиентских путей и Реестра Процессов ПАО Сбербанк»</w:t>
+        <w:t xml:space="preserve"> </w:t>
+      </w:r>
+      <w:r>
+        <w:rPr>
+          <w:rFonts w:ascii="Times New Roman" w:hAnsi="Times New Roman"/>
+        </w:rPr>
+        <w:t>В исключительных случаях, определяемых руководством СВА, допускается не указывать количество проверяемых клиентских путей и процессов Банка</w:t>
       </w:r>
     </w:p>
   </w:footnote>
@@ -4585,38 +4003,160 @@
         <w:rPr>
           <w:rFonts w:ascii="Times New Roman" w:hAnsi="Times New Roman"/>
         </w:rPr>
-        <w:t xml:space="preserve"> Наименование путей и процессов утверждены Распоряжением от 28.01.2022 № 202-Р «Об утверждении Реестра Клиентских путей и Реестра Процессов ПАО Сбербанк»</w:t>
-      </w:r>
-    </w:p>
-  </w:footnote>
-  <w:footnote w:id="5">
-    <w:p>
-      <w:pPr>
-        <w:pStyle w:val="ad"/>
-        <w:jc w:val="both"/>
-        <w:rPr>
-          <w:rFonts w:ascii="Times New Roman" w:hAnsi="Times New Roman"/>
-        </w:rPr>
-      </w:pPr>
-      <w:r>
-        <w:rPr>
-          <w:rStyle w:val="af"/>
-          <w:rFonts w:ascii="Times New Roman" w:hAnsi="Times New Roman"/>
-        </w:rPr>
-        <w:footnoteRef/>
-      </w:r>
-      <w:r>
-        <w:rPr>
-          <w:rFonts w:ascii="Times New Roman" w:hAnsi="Times New Roman"/>
-        </w:rPr>
-        <w:t xml:space="preserve"> </w:t>
-      </w:r>
-      <w:r>
-        <w:rPr>
-          <w:rFonts w:ascii="Times New Roman" w:hAnsi="Times New Roman"/>
-        </w:rPr>
-        <w:t>Сокращения по тексту используются согласно Технологической схеме процесса «Управление Каталогом ИТ-услуг» в ПАО Сбербанк от 20.10.2020 № 4381-3</w:t>
-      </w:r>
+        <w:t xml:space="preserve"> Реестр КП и П размещен (ссылка внешняя): </w:t>
+      </w:r>
+      <w:hyperlink r:id="rId1" w:history="1">
+        <w:r>
+          <w:rPr>
+            <w:rStyle w:val="a3"/>
+            <w:rFonts w:ascii="Times New Roman" w:hAnsi="Times New Roman"/>
+            <w:lang w:val="en-US"/>
+          </w:rPr>
+          <w:t>https</w:t>
+        </w:r>
+        <w:r>
+          <w:rPr>
+            <w:rStyle w:val="a3"/>
+            <w:rFonts w:ascii="Times New Roman" w:hAnsi="Times New Roman"/>
+          </w:rPr>
+          <w:t>://</w:t>
+        </w:r>
+        <w:r>
+          <w:rPr>
+            <w:rStyle w:val="a3"/>
+            <w:rFonts w:ascii="Times New Roman" w:hAnsi="Times New Roman"/>
+            <w:lang w:val="en-US"/>
+          </w:rPr>
+          <w:t>sbatlas</w:t>
+        </w:r>
+        <w:r>
+          <w:rPr>
+            <w:rStyle w:val="a3"/>
+            <w:rFonts w:ascii="Times New Roman" w:hAnsi="Times New Roman"/>
+          </w:rPr>
+          <w:t>.</w:t>
+        </w:r>
+        <w:r>
+          <w:rPr>
+            <w:rStyle w:val="a3"/>
+            <w:rFonts w:ascii="Times New Roman" w:hAnsi="Times New Roman"/>
+            <w:lang w:val="en-US"/>
+          </w:rPr>
+          <w:t>sigma</w:t>
+        </w:r>
+        <w:r>
+          <w:rPr>
+            <w:rStyle w:val="a3"/>
+            <w:rFonts w:ascii="Times New Roman" w:hAnsi="Times New Roman"/>
+          </w:rPr>
+          <w:t>.</w:t>
+        </w:r>
+        <w:r>
+          <w:rPr>
+            <w:rStyle w:val="a3"/>
+            <w:rFonts w:ascii="Times New Roman" w:hAnsi="Times New Roman"/>
+            <w:lang w:val="en-US"/>
+          </w:rPr>
+          <w:t>sbrf</w:t>
+        </w:r>
+        <w:r>
+          <w:rPr>
+            <w:rStyle w:val="a3"/>
+            <w:rFonts w:ascii="Times New Roman" w:hAnsi="Times New Roman"/>
+          </w:rPr>
+          <w:t>.</w:t>
+        </w:r>
+        <w:r>
+          <w:rPr>
+            <w:rStyle w:val="a3"/>
+            <w:rFonts w:ascii="Times New Roman" w:hAnsi="Times New Roman"/>
+            <w:lang w:val="en-US"/>
+          </w:rPr>
+          <w:t>ru</w:t>
+        </w:r>
+        <w:r>
+          <w:rPr>
+            <w:rStyle w:val="a3"/>
+            <w:rFonts w:ascii="Times New Roman" w:hAnsi="Times New Roman"/>
+          </w:rPr>
+          <w:t>/</w:t>
+        </w:r>
+        <w:r>
+          <w:rPr>
+            <w:rStyle w:val="a3"/>
+            <w:rFonts w:ascii="Times New Roman" w:hAnsi="Times New Roman"/>
+            <w:lang w:val="en-US"/>
+          </w:rPr>
+          <w:t>wiki</w:t>
+        </w:r>
+        <w:r>
+          <w:rPr>
+            <w:rStyle w:val="a3"/>
+            <w:rFonts w:ascii="Times New Roman" w:hAnsi="Times New Roman"/>
+          </w:rPr>
+          <w:t>/</w:t>
+        </w:r>
+        <w:r>
+          <w:rPr>
+            <w:rStyle w:val="a3"/>
+            <w:rFonts w:ascii="Times New Roman" w:hAnsi="Times New Roman"/>
+            <w:lang w:val="en-US"/>
+          </w:rPr>
+          <w:t>pages</w:t>
+        </w:r>
+        <w:r>
+          <w:rPr>
+            <w:rStyle w:val="a3"/>
+            <w:rFonts w:ascii="Times New Roman" w:hAnsi="Times New Roman"/>
+          </w:rPr>
+          <w:t>/</w:t>
+        </w:r>
+        <w:r>
+          <w:rPr>
+            <w:rStyle w:val="a3"/>
+            <w:rFonts w:ascii="Times New Roman" w:hAnsi="Times New Roman"/>
+            <w:lang w:val="en-US"/>
+          </w:rPr>
+          <w:t>viewpage</w:t>
+        </w:r>
+        <w:r>
+          <w:rPr>
+            <w:rStyle w:val="a3"/>
+            <w:rFonts w:ascii="Times New Roman" w:hAnsi="Times New Roman"/>
+          </w:rPr>
+          <w:t>.</w:t>
+        </w:r>
+        <w:r>
+          <w:rPr>
+            <w:rStyle w:val="a3"/>
+            <w:rFonts w:ascii="Times New Roman" w:hAnsi="Times New Roman"/>
+            <w:lang w:val="en-US"/>
+          </w:rPr>
+          <w:t>action</w:t>
+        </w:r>
+        <w:r>
+          <w:rPr>
+            <w:rStyle w:val="a3"/>
+            <w:rFonts w:ascii="Times New Roman" w:hAnsi="Times New Roman"/>
+          </w:rPr>
+          <w:t>?</w:t>
+        </w:r>
+        <w:r>
+          <w:rPr>
+            <w:rStyle w:val="a3"/>
+            <w:rFonts w:ascii="Times New Roman" w:hAnsi="Times New Roman"/>
+            <w:lang w:val="en-US"/>
+          </w:rPr>
+          <w:t>pageId</w:t>
+        </w:r>
+        <w:r>
+          <w:rPr>
+            <w:rStyle w:val="a3"/>
+            <w:rFonts w:ascii="Times New Roman" w:hAnsi="Times New Roman"/>
+          </w:rPr>
+          <w:t>=1592127088</w:t>
+        </w:r>
+      </w:hyperlink>
     </w:p>
   </w:footnote>
 </w:footnotes>
@@ -6444,6 +5984,18 @@
       <w:szCs w:val="20"/>
     </w:rPr>
   </w:style>
+  <w:style w:type="character" w:styleId="af4">
+    <w:name w:val="Unresolved Mention"/>
+    <w:basedOn w:val="a0"/>
+    <w:uiPriority w:val="99"/>
+    <w:semiHidden/>
+    <w:unhideWhenUsed/>
+    <w:rsid w:val="00D8540C"/>
+    <w:rPr>
+      <w:color w:val="605E5C"/>
+      <w:shd w:val="clear" w:color="auto" w:fill="E1DFDD"/>
+    </w:rPr>
+  </w:style>
 </w:styles>
 </file>
 

</xml_diff>